<commit_message>
docs: finalize Auth+Onboarding SRS v2 — two-gate FR-ONB-13, upload-before-submit flow, production deployment recorded
</commit_message>
<xml_diff>
--- a/docs/SRS-Auth-Onboarding-Module-v2.docx
+++ b/docs/SRS-Auth-Onboarding-Module-v2.docx
@@ -112,7 +112,7 @@
                 <w:b w:val="0"/>
                 <w:sz w:val="20"/>
               </w:rPr>
-              <w:t>Implemented &amp; live; document-type enforcement pending placement decision</w:t>
+              <w:t>Implemented, verified &amp; DEPLOYED to production (2026-07-03). Document types enforced at both the submission gate and the admin-approval gate.</w:t>
             </w:r>
           </w:p>
         </w:tc>
@@ -144,7 +144,7 @@
                 <w:b w:val="0"/>
                 <w:sz w:val="20"/>
               </w:rPr>
-              <w:t>Role renamed “Company” → “Scholarship Provider” across the system; SSO, security &amp; onboarding-document requirements refined</w:t>
+              <w:t>Role renamed “Company” → “Scholarship Provider” across the system; SSO, security &amp; onboarding-document requirements refined; document typing + two-gate enforcement added.</w:t>
             </w:r>
           </w:p>
         </w:tc>
@@ -3456,7 +3456,7 @@
                 <w:b w:val="0"/>
                 <w:sz w:val="19"/>
               </w:rPr>
-              <w:t>The system shall not allow an onboarding or Consultant-upgrade request to be APPROVED until every required document type for that role is present; the reviewer shall be shown which required types are missing. (Enforcement is applied at the admin-approval gate because verification documents are uploaded on the pending-review screen, after role selection.)</w:t>
+              <w:t>The system shall enforce the required document types at TWO gates (defense-in-depth): (a) an onboarding or Consultant-upgrade request cannot be SUBMITTED until every required document type is uploaded (the wizard uploads typed documents on a dedicated documents step before submission); and (b) an Admin cannot APPROVE a request until every required type is present, with any missing types shown to the reviewer.</w:t>
             </w:r>
           </w:p>
         </w:tc>
@@ -5218,7 +5218,7 @@
           <w:i w:val="0"/>
           <w:sz w:val="21"/>
         </w:rPr>
-        <w:t>On first login an Unassigned user selects a role (FR-ONB-01). Student activates immediately (FR-ONB-02). Scholarship Provider and Consultant capture the role-specific fields (FR-ONB-03/04) and move to PendingApproval, entering the Admin queue (FR-ONB-05). Verification documents are uploaded on the pending-review screen; each upload is tagged with its document type (FR-ONB-12). The provider organisation-type option 'Corporation' replaces the former 'Company'.</w:t>
+        <w:t>On first login an Unassigned user selects a role (FR-ONB-01). Student activates immediately (FR-ONB-02). A Scholarship Provider or Consultant applicant completes the role-specific fields (FR-ONB-03/04), then a dedicated documents step where each verification document is uploaded tagged with its type (FR-ONB-12). The request is submitted — moving the account to PendingApproval and into the Admin queue (FR-ONB-05) — only once every required document type is present (FR-ONB-13, submission gate). The provider organisation-type option 'Corporation' replaces the former 'Company'.</w:t>
       </w:r>
     </w:p>
     <w:p>
@@ -5239,7 +5239,7 @@
           <w:i w:val="0"/>
           <w:sz w:val="21"/>
         </w:rPr>
-        <w:t>The Admin onboarding queue lists each pending applicant with their profile and their uploaded verification documents, each labelled by type and downloadable, so review is by document type rather than file name (FR-ONB-14). Approval requires all mandatory document types for the role to be present; the reviewer is shown any missing required types and cannot approve until they are supplied (FR-ONB-13). Approval activates the Identity role and sets the account Active; rejection returns the applicant to Unassigned with a reason, which the wizard surfaces on resubmission (FR-ONB-06/07).</w:t>
+        <w:t>The Admin onboarding queue lists each pending applicant with their profile and their uploaded verification documents, each labelled by type and downloadable, so review is by document type rather than file name (FR-ONB-14). Approval re-checks that all mandatory document types for the role are present (FR-ONB-13, admin-approval gate — a backstop to the submission gate); the reviewer is shown any missing required types and cannot approve until they are supplied. Approval activates the Identity role and sets the account Active; rejection returns the applicant to Unassigned with a reason, which the wizard surfaces on resubmission (FR-ONB-06/07).</w:t>
       </w:r>
     </w:p>
     <w:p>
@@ -5854,7 +5854,7 @@
                 <w:b w:val="0"/>
                 <w:sz w:val="19"/>
               </w:rPr>
-              <w:t>Required document types must be present before admin approval (enforcement placement to be confirmed).</w:t>
+              <w:t>Required document types enforced at BOTH the submission gate and the admin-approval gate (defense-in-depth); onboarding wizard uploads typed documents before submission.</w:t>
             </w:r>
           </w:p>
         </w:tc>
@@ -5869,7 +5869,54 @@
                 <w:b w:val="0"/>
                 <w:sz w:val="18"/>
               </w:rPr>
-              <w:t>PR #54 (pending)</w:t>
+              <w:t>PR #54</w:t>
+            </w:r>
+          </w:p>
+        </w:tc>
+      </w:tr>
+      <w:tr>
+        <w:tc>
+          <w:tcPr>
+            <w:tcW w:type="dxa" w:w="1872"/>
+          </w:tcPr>
+          <w:p>
+            <w:r/>
+            <w:r>
+              <w:rPr>
+                <w:b/>
+                <w:sz w:val="19"/>
+              </w:rPr>
+              <w:t>Deployment</w:t>
+            </w:r>
+          </w:p>
+        </w:tc>
+        <w:tc>
+          <w:tcPr>
+            <w:tcW w:type="dxa" w:w="7056"/>
+          </w:tcPr>
+          <w:p>
+            <w:r/>
+            <w:r>
+              <w:rPr>
+                <w:b w:val="0"/>
+                <w:sz w:val="19"/>
+              </w:rPr>
+              <w:t>Merged to main and deployed to production. DB rename migration verified on a copy of production data first — which caught and fixed a column-truncation bug (UpgradeRequests.Target widened 16→32) before it could reach production. Post-deploy checks: API /health 200, frontend 200, 70 provider accounts + all data migrated intact, old tables removed.</w:t>
+            </w:r>
+          </w:p>
+        </w:tc>
+        <w:tc>
+          <w:tcPr>
+            <w:tcW w:type="dxa" w:w="1584"/>
+          </w:tcPr>
+          <w:p>
+            <w:r/>
+            <w:r>
+              <w:rPr>
+                <w:b w:val="0"/>
+                <w:sz w:val="18"/>
+              </w:rPr>
+              <w:t>2026-07-03</w:t>
             </w:r>
           </w:p>
         </w:tc>
@@ -5888,10 +5935,10 @@
       <w:r>
         <w:rPr>
           <w:i/>
-          <w:color w:val="804000"/>
+          <w:color w:val="206020"/>
           <w:sz w:val="19"/>
         </w:rPr>
-        <w:t>Open decision: FR-ONB-13 enforcement is specified at the admin-approval gate because verification documents are uploaded after role selection. Confirm this placement (vs. moving document upload before submission) before the enforcement code is enabled.</w:t>
+        <w:t>Status: this module is complete and live in production as of 2026-07-03. FR-ONB-13 is enforced at both gates (submission + admin approval). No functional decisions remain open for this module.</w:t>
       </w:r>
     </w:p>
     <w:sectPr>

</xml_diff>

<commit_message>
feat(auth): require email verification before onboarding (FR-AUTH-05) — server gate on role selection + client verification screen + grandfather existing accounts; update SRS
</commit_message>
<xml_diff>
--- a/docs/SRS-Auth-Onboarding-Module-v2.docx
+++ b/docs/SRS-Auth-Onboarding-Module-v2.docx
@@ -901,6 +901,7 @@
         <w:tc>
           <w:tcPr>
             <w:tcW w:type="dxa" w:w="1368"/>
+            <w:shd w:val="clear" w:fill="FFF6E5"/>
           </w:tcPr>
           <w:p>
             <w:r/>
@@ -916,6 +917,7 @@
         <w:tc>
           <w:tcPr>
             <w:tcW w:type="dxa" w:w="720"/>
+            <w:shd w:val="clear" w:fill="FFF6E5"/>
           </w:tcPr>
           <w:p>
             <w:r/>
@@ -931,6 +933,7 @@
         <w:tc>
           <w:tcPr>
             <w:tcW w:type="dxa" w:w="5328"/>
+            <w:shd w:val="clear" w:fill="FFF6E5"/>
           </w:tcPr>
           <w:p>
             <w:r/>
@@ -939,13 +942,14 @@
                 <w:b w:val="0"/>
                 <w:sz w:val="19"/>
               </w:rPr>
-              <w:t>The system shall send an email verification link upon registration. Verification is non-blocking; unverified users may proceed to onboarding.</w:t>
+              <w:t>The system shall send an email verification link upon registration. Email verification is REQUIRED: an unverified account is blocked from onboarding — the server rejects role selection and the client shows a verification gate (with a resend option) — until the email is confirmed. Accounts existing at rollout were grandfathered as verified so the rule affects only new sign-ups.</w:t>
             </w:r>
           </w:p>
         </w:tc>
         <w:tc>
           <w:tcPr>
             <w:tcW w:type="dxa" w:w="1944"/>
+            <w:shd w:val="clear" w:fill="FFF6E5"/>
           </w:tcPr>
           <w:p>
             <w:r/>
@@ -961,15 +965,16 @@
         <w:tc>
           <w:tcPr>
             <w:tcW w:type="dxa" w:w="1224"/>
-          </w:tcPr>
-          <w:p>
-            <w:r/>
-            <w:r>
-              <w:rPr>
-                <w:b w:val="0"/>
-                <w:sz w:val="19"/>
-              </w:rPr>
-              <w:t>Unchanged</w:t>
+            <w:shd w:val="clear" w:fill="FFF6E5"/>
+          </w:tcPr>
+          <w:p>
+            <w:r/>
+            <w:r>
+              <w:rPr>
+                <w:b/>
+                <w:sz w:val="19"/>
+              </w:rPr>
+              <w:t>Updated</w:t>
             </w:r>
           </w:p>
         </w:tc>
@@ -5729,6 +5734,53 @@
                 <w:sz w:val="18"/>
               </w:rPr>
               <w:t>PR #51</w:t>
+            </w:r>
+          </w:p>
+        </w:tc>
+      </w:tr>
+      <w:tr>
+        <w:tc>
+          <w:tcPr>
+            <w:tcW w:type="dxa" w:w="1872"/>
+          </w:tcPr>
+          <w:p>
+            <w:r/>
+            <w:r>
+              <w:rPr>
+                <w:b/>
+                <w:sz w:val="19"/>
+              </w:rPr>
+              <w:t>FR-AUTH-05 (changed)</w:t>
+            </w:r>
+          </w:p>
+        </w:tc>
+        <w:tc>
+          <w:tcPr>
+            <w:tcW w:type="dxa" w:w="7056"/>
+          </w:tcPr>
+          <w:p>
+            <w:r/>
+            <w:r>
+              <w:rPr>
+                <w:b w:val="0"/>
+                <w:sz w:val="19"/>
+              </w:rPr>
+              <w:t>Email verification changed from non-blocking to REQUIRED before onboarding (server gate on role selection + client verification screen). Existing accounts grandfathered as verified via a data migration.</w:t>
+            </w:r>
+          </w:p>
+        </w:tc>
+        <w:tc>
+          <w:tcPr>
+            <w:tcW w:type="dxa" w:w="1584"/>
+          </w:tcPr>
+          <w:p>
+            <w:r/>
+            <w:r>
+              <w:rPr>
+                <w:b w:val="0"/>
+                <w:sz w:val="18"/>
+              </w:rPr>
+              <w:t>2026-07-03</w:t>
             </w:r>
           </w:p>
         </w:tc>

</xml_diff>

<commit_message>
fix(onboarding): clear pending ActiveRole on onboarding rejection (clean Unassigned state) + test; update SRS
</commit_message>
<xml_diff>
--- a/docs/SRS-Auth-Onboarding-Module-v2.docx
+++ b/docs/SRS-Auth-Onboarding-Module-v2.docx
@@ -5766,6 +5766,53 @@
                 <w:sz w:val="19"/>
               </w:rPr>
               <w:t>Email verification changed from non-blocking to REQUIRED before onboarding (server gate on role selection + client verification screen). Existing accounts grandfathered as verified via a data migration.</w:t>
+            </w:r>
+          </w:p>
+        </w:tc>
+        <w:tc>
+          <w:tcPr>
+            <w:tcW w:type="dxa" w:w="1584"/>
+          </w:tcPr>
+          <w:p>
+            <w:r/>
+            <w:r>
+              <w:rPr>
+                <w:b w:val="0"/>
+                <w:sz w:val="18"/>
+              </w:rPr>
+              <w:t>2026-07-03</w:t>
+            </w:r>
+          </w:p>
+        </w:tc>
+      </w:tr>
+      <w:tr>
+        <w:tc>
+          <w:tcPr>
+            <w:tcW w:type="dxa" w:w="1872"/>
+          </w:tcPr>
+          <w:p>
+            <w:r/>
+            <w:r>
+              <w:rPr>
+                <w:b/>
+                <w:sz w:val="19"/>
+              </w:rPr>
+              <w:t>FR-ONB-06 (fix)</w:t>
+            </w:r>
+          </w:p>
+        </w:tc>
+        <w:tc>
+          <w:tcPr>
+            <w:tcW w:type="dxa" w:w="7056"/>
+          </w:tcPr>
+          <w:p>
+            <w:r/>
+            <w:r>
+              <w:rPr>
+                <w:b w:val="0"/>
+                <w:sz w:val="19"/>
+              </w:rPr>
+              <w:t>On rejection the account now clears its pending ActiveRole, so a rejected applicant returns to a clean Unassigned state (previously it kept a dangling role that could mis-route the UI).</w:t>
             </w:r>
           </w:p>
         </w:tc>

</xml_diff>